<commit_message>
Reorder lesson plans 7 and 8
</commit_message>
<xml_diff>
--- a/P2/plan/07.docx
+++ b/P2/plan/07.docx
@@ -2,7 +2,7 @@
 <file path=word/document.xml><?xml version="1.0" encoding="utf-8"?>
 <w:document xmlns:w="http://schemas.openxmlformats.org/wordprocessingml/2006/main" xmlns:m="http://schemas.openxmlformats.org/officeDocument/2006/math" xmlns:r="http://schemas.openxmlformats.org/officeDocument/2006/relationships" xmlns:o="urn:schemas-microsoft-com:office:office" xmlns:v="urn:schemas-microsoft-com:vml" xmlns:w10="urn:schemas-microsoft-com:office:word" xmlns:a="http://schemas.openxmlformats.org/drawingml/2006/main" xmlns:pic="http://schemas.openxmlformats.org/drawingml/2006/picture" xmlns:wp="http://schemas.openxmlformats.org/drawingml/2006/wordprocessingDrawing">
   <w:body>
-    <w:bookmarkStart w:id="35" w:name="แผนการจดการเรยนร"/>
+    <w:bookmarkStart w:id="37" w:name="แผนการจดการเรยนร"/>
     <w:p>
       <w:pPr>
         <w:pStyle w:val="Heading1"/>
@@ -154,7 +154,7 @@
         <w:t xml:space="preserve"> </w:t>
       </w:r>
       <w:r>
-        <w:t xml:space="preserve">เรื่อง มาตราแม่กบ</w:t>
+        <w:t xml:space="preserve">เรื่อง มาตราแม่กน</w:t>
       </w:r>
       <w:r>
         <w:t xml:space="preserve"> </w:t>
@@ -264,7 +264,7 @@
         <w:pStyle w:val="FirstParagraph"/>
       </w:pPr>
       <w:r>
-        <w:t xml:space="preserve">มาตราแม่กบ คือ คำที่ออกเสียงสะกดแม่กบ ทั้งตัวสะกดตรงมาตรา (บ) และไม่ตรงมาตรา (ป, พ, ฟ, ภ) การเรียนรู้ผ่าน Web Application เกมมิฟิเคชัน เป็นสื่อหลัก จะช่วยให้นักเรียนสังเกตเสียงพยัญชนะท้ายคำ เข้าใจความแตกต่างของการเขียนสะกดคำที่หลากหลายในแม่กบ และสามารถนำคำไปใช้สื่อความหมายได้อย่างถูกต้องผ่านภารกิจในระบบ</w:t>
+        <w:t xml:space="preserve">มาตราแม่กน คือ คำที่ออกเสียงสะกดแม่กน ทั้งตัวสะกดตรงมาตรา (น) และไม่ตรงมาตรา (ญ, ณ, ร, ล, ฬ) การเรียนรู้ผ่าน Web Application เกมมิฟิเคชัน เป็นสื่อหลัก จะช่วยให้นักเรียนสังเกตเสียงพยัญชนะท้ายคำ เข้าใจความแตกต่างของการเขียนสะกดคำที่หลากหลายในแม่กน และสามารถนำคำไปใช้สื่อความหมายได้อย่างถูกต้องผ่านภารกิจในระบบ</w:t>
       </w:r>
     </w:p>
     <w:bookmarkEnd w:id="21"/>
@@ -296,7 +296,7 @@
         <w:t xml:space="preserve"> </w:t>
       </w:r>
       <w:r>
-        <w:t xml:space="preserve">นักเรียนบอกความหมายและลักษณะของคำในแม่กบได้ถูกต้อง</w:t>
+        <w:t xml:space="preserve">นักเรียนบอกความหมายและลักษณะของคำในแม่กนได้ถูกต้อง</w:t>
       </w:r>
     </w:p>
     <w:p>
@@ -318,7 +318,7 @@
         <w:t xml:space="preserve"> </w:t>
       </w:r>
       <w:r>
-        <w:t xml:space="preserve">นักเรียนอ่าน เขียน และจำแนกคำในแม่กบทั้งตรงมาตราและไม่ตรงมาตราได้ถูกต้องผ่านภารกิจใน Web Application</w:t>
+        <w:t xml:space="preserve">นักเรียนอ่าน เขียน และจำแนกคำในแม่กนทั้งตรงมาตราและไม่ตรงมาตราได้ถูกต้องผ่านภารกิจใน Web Application</w:t>
       </w:r>
     </w:p>
     <w:p>
@@ -362,7 +362,7 @@
         <w:pStyle w:val="Compact"/>
       </w:pPr>
       <w:r>
-        <w:t xml:space="preserve">ลักษณะของมาตราแม่กบ (คำที่ออกเสียงเหมือน บ สะกด)</w:t>
+        <w:t xml:space="preserve">ลักษณะของมาตราแม่กน (คำที่ออกเสียงเหมือน น สะกด)</w:t>
       </w:r>
     </w:p>
     <w:p>
@@ -374,7 +374,7 @@
         <w:pStyle w:val="Compact"/>
       </w:pPr>
       <w:r>
-        <w:t xml:space="preserve">การอ่านออกเสียง จำแนกคำ และบอกความหมายของคำในมาตราแม่กบ</w:t>
+        <w:t xml:space="preserve">การอ่านออกเสียง จำแนกคำ และบอกความหมายของคำในมาตราแม่กน</w:t>
       </w:r>
     </w:p>
     <w:p>
@@ -386,7 +386,7 @@
         <w:pStyle w:val="Compact"/>
       </w:pPr>
       <w:r>
-        <w:t xml:space="preserve">ตัวอย่างคำมาตราแม่กบ (ตรงมาตรา): กบ, ดาบ, สิบ, อาบ, จับ</w:t>
+        <w:t xml:space="preserve">ตัวอย่างคำมาตราแม่กน (ตรงมาตรา): ช้อน, บ้าน, บิน, นอน, จาน</w:t>
       </w:r>
     </w:p>
     <w:p>
@@ -398,7 +398,7 @@
         <w:pStyle w:val="Compact"/>
       </w:pPr>
       <w:r>
-        <w:t xml:space="preserve">ตัวอย่างคำมาตราแม่กบ (ไม่ตรงมาตรา): รูป, ภาพ, ยีราฟ, โลภ, ทัพ</w:t>
+        <w:t xml:space="preserve">ตัวอย่างคำมาตราแม่กน (ไม่ตรงมาตรา): ของขวัญ, คุณ, ทหาร, พยาบาล, ปลาวาฬ</w:t>
       </w:r>
     </w:p>
     <w:p>
@@ -410,7 +410,7 @@
         <w:pStyle w:val="Compact"/>
       </w:pPr>
       <w:r>
-        <w:t xml:space="preserve">ตัวอย่างคำมาตราอื่น (ใช้เปรียบเทียบหลอกในเกม): ช้าง, มด, ดาว, ส้ม</w:t>
+        <w:t xml:space="preserve">ตัวอย่างคำมาตราอื่น (ใช้เปรียบเทียบหลอกในเกม): สุนัข, เมฆ, รูป, ปาก</w:t>
       </w:r>
     </w:p>
     <w:bookmarkEnd w:id="23"/>
@@ -464,7 +464,7 @@
         <w:t xml:space="preserve"> </w:t>
       </w:r>
       <w:r>
-        <w:t xml:space="preserve">การสังเกต วิเคราะห์ และจำแนกเสียงท้ายคำ /บ/ ที่สะกดด้วยพยัญชนะต่างรูป</w:t>
+        <w:t xml:space="preserve">การสังเกต วิเคราะห์ และจำแนกเสียงท้ายคำ /น/ ที่สะกดด้วยพยัญชนะต่างรูป</w:t>
       </w:r>
     </w:p>
     <w:p>
@@ -547,7 +547,7 @@
         <w:t xml:space="preserve">“</w:t>
       </w:r>
       <w:r>
-        <w:t xml:space="preserve">แผนผังเกาะแม่กบ</w:t>
+        <w:t xml:space="preserve">แผนที่ดาวแม่กน</w:t>
       </w:r>
       <w:r>
         <w:t xml:space="preserve">”</w:t>
@@ -580,7 +580,7 @@
         <w:pStyle w:val="Compact"/>
       </w:pPr>
       <w:r>
-        <w:t xml:space="preserve">ใบงานที่ 7 เรื่อง มาตราแม่กบ</w:t>
+        <w:t xml:space="preserve">ใบงานที่ 7 เรื่อง มาตราแม่กน</w:t>
       </w:r>
     </w:p>
     <w:bookmarkEnd w:id="26"/>
@@ -634,7 +634,7 @@
         <w:t xml:space="preserve">“</w:t>
       </w:r>
       <w:r>
-        <w:t xml:space="preserve">แอนิเมชันผจญภัยเกาะแม่กบ</w:t>
+        <w:t xml:space="preserve">แอนิเมชันนักสำรวจอวกาศแม่กน</w:t>
       </w:r>
       <w:r>
         <w:t xml:space="preserve">”</w:t>
@@ -643,7 +643,7 @@
         <w:t xml:space="preserve"> </w:t>
       </w:r>
       <w:r>
-        <w:t xml:space="preserve">ผ่านโหมดนำเสนอ (Presentation Mode) ใน Web Application ขึ้นจอโปรเจกเตอร์ เป็นเรื่องราวการเดินทางสำรวจเกาะที่ต้องตามหาไอเทมที่มีเสียง /บ/ ท้ายคำ</w:t>
+        <w:t xml:space="preserve">ผ่านโหมดนำเสนอ (Presentation Mode) ใน Web Application ขึ้นจอโปรเจกเตอร์ เป็นเรื่องราวยานอวกาศที่ต้องการเชื้อเพลิงเป็นคำที่มีเสียง /น/ ท้ายคำ เพื่อเดินทางต่อ</w:t>
       </w:r>
     </w:p>
     <w:p>
@@ -660,7 +660,7 @@
         <w:t xml:space="preserve">“</w:t>
       </w:r>
       <w:r>
-        <w:t xml:space="preserve">นักเรียนคิดว่า นอกจากตัว บ ใบไม้ แล้ว มีตัวอักษรใดบ้างที่ซ่อนรูปและออกเสียงเหมือน บ สะกด?</w:t>
+        <w:t xml:space="preserve">นักเรียนคิดว่า นอกจากตัว น หนู แล้ว มีตัวอักษรใดบ้างที่ซ่อนรูปและออกเสียงเหมือน น สะกด?</w:t>
       </w:r>
       <w:r>
         <w:t xml:space="preserve">”</w:t>
@@ -681,7 +681,7 @@
         <w:pStyle w:val="FirstParagraph"/>
       </w:pPr>
       <w:r>
-        <w:t xml:space="preserve">2.1 ครูคลิกสไลด์ถัดไปใน Web Application เพื่อแสดงชุดคำศัพท์แม่กบ (เช่น ดาบ, รูป, ภาพ, ยีราฟ, โลภ) โดยระบบจะไฮไลต์สีสันที่ตัวสะกดท้ายคำให้โดดเด่น</w:t>
+        <w:t xml:space="preserve">2.1 ครูคลิกสไลด์ถัดไปใน Web Application เพื่อแสดงชุดคำศัพท์แม่กน (เช่น บ้าน, ของขวัญ, คุณ, ทหาร, พยาบาล, ปลาวาฬ) โดยระบบจะไฮไลต์สีสันที่ตัวสะกดท้ายคำให้โดดเด่น</w:t>
       </w:r>
     </w:p>
     <w:p>
@@ -706,7 +706,7 @@
         <w:t xml:space="preserve">“</w:t>
       </w:r>
       <w:r>
-        <w:t xml:space="preserve">คำที่ออกเสียงเหมือน บ สะกด ไม่ว่าจะเขียนด้วย บ, ป, พ, ฟ หรือ ภ เรียกว่า มาตราแม่กบ</w:t>
+        <w:t xml:space="preserve">คำที่ออกเสียงเหมือน น สะกด ไม่ว่าจะเขียนด้วย น, ญ, ณ, ร, ล หรือ ฬ เรียกว่า มาตราแม่กน</w:t>
       </w:r>
       <w:r>
         <w:t xml:space="preserve">”</w:t>
@@ -764,7 +764,7 @@
           <w:bCs/>
           <w:b/>
         </w:rPr>
-        <w:t xml:space="preserve">เก็บเสบียงแม่กบ</w:t>
+        <w:t xml:space="preserve">เติมเชื้อเพลิงยานแม่กน</w:t>
       </w:r>
       <w:r>
         <w:rPr>
@@ -777,7 +777,7 @@
         <w:t xml:space="preserve"> </w:t>
       </w:r>
       <w:r>
-        <w:t xml:space="preserve">(ด่านจำแนกคำ): บนหน้าจออุปกรณ์ของนักเรียนจะแสดงเสบียงอาหารและสิ่งของต่าง ๆ นักเรียนต้องกดเลือกเฉพาะไอเทมที่มีคำศัพท์มาตราแม่กบ (เช่น จานรูปภาพ, ดาบ) หากเลือกถูกไอเทมจะถูกเก็บลงกระเป๋าและได้คะแนน หากเลือกคำมาตราอื่นกระเป๋าจะเด้งออก</w:t>
+        <w:t xml:space="preserve">(ด่านจำแนกคำ): บนหน้าจออุปกรณ์ของนักเรียนจะแสดงถังเชื้อเพลิงและคริสตัลพลังงานที่มีคำศัพท์ต่าง ๆ นักเรียนต้องกดเลือกเฉพาะคริสตัลคำศัพท์มาตราแม่กน (เช่น ของขวัญ, บ้าน) หากเลือกถูกคริสตัลจะถูกดูดเข้ายานและได้คะแนน หากเลือกคำมาตราอื่นยานจะส่งเสียงเตือน</w:t>
       </w:r>
     </w:p>
     <w:p>
@@ -816,7 +816,7 @@
           <w:bCs/>
           <w:b/>
         </w:rPr>
-        <w:t xml:space="preserve">ไขปริศนาชาวเกาะ</w:t>
+        <w:t xml:space="preserve">สแกนรหัสลับต่างดาว</w:t>
       </w:r>
       <w:r>
         <w:rPr>
@@ -847,7 +847,7 @@
         <w:t xml:space="preserve">‘</w:t>
       </w:r>
       <w:r>
-        <w:t xml:space="preserve">รูปภาพ</w:t>
+        <w:t xml:space="preserve">พยาบาล</w:t>
       </w:r>
       <w:r>
         <w:t xml:space="preserve">’</w:t>
@@ -856,7 +856,7 @@
         <w:t xml:space="preserve"> </w:t>
       </w:r>
       <w:r>
-        <w:t xml:space="preserve">เป็นคำมาตราแม่กบ ใช่หรือไม่?</w:t>
+        <w:t xml:space="preserve">เป็นคำมาตราแม่กน ใช่หรือไม่?</w:t>
       </w:r>
       <w:r>
         <w:t xml:space="preserve">”</w:t>
@@ -883,7 +883,7 @@
         <w:t xml:space="preserve">‘</w:t>
       </w:r>
       <w:r>
-        <w:t xml:space="preserve">ยีราฟ</w:t>
+        <w:t xml:space="preserve">ของขวัญ</w:t>
       </w:r>
       <w:r>
         <w:t xml:space="preserve">’</w:t>
@@ -892,7 +892,7 @@
         <w:t xml:space="preserve"> </w:t>
       </w:r>
       <w:r>
-        <w:t xml:space="preserve">สะกดด้วย พ พาน ใช่หรือไม่?</w:t>
+        <w:t xml:space="preserve">สะกดด้วย ร เรือ ใช่หรือไม่?</w:t>
       </w:r>
       <w:r>
         <w:t xml:space="preserve">”</w:t>
@@ -972,7 +972,7 @@
         <w:t xml:space="preserve">“</w:t>
       </w:r>
       <w:r>
-        <w:t xml:space="preserve">แผนผังเกาะแม่กบ</w:t>
+        <w:t xml:space="preserve">แผนที่ดาวแม่กน</w:t>
       </w:r>
       <w:r>
         <w:t xml:space="preserve">”</w:t>
@@ -998,7 +998,7 @@
         <w:t xml:space="preserve">“</w:t>
       </w:r>
       <w:r>
-        <w:t xml:space="preserve">บ สะกด (ตรงมาตรา)</w:t>
+        <w:t xml:space="preserve">น สะกด (ตรงมาตรา)</w:t>
       </w:r>
       <w:r>
         <w:t xml:space="preserve">”</w:t>
@@ -1055,7 +1055,7 @@
           <w:bCs/>
           <w:b/>
         </w:rPr>
-        <w:t xml:space="preserve">มาตราแม่กบ คือ คำที่ออกเสียงเหมือนมี บ สะกด แม้จะเขียนด้วยพยัญชนะต่างรูปกัน เช่น บ, ป, พ, ฟ, ภ</w:t>
+        <w:t xml:space="preserve">มาตราแม่กน คือ คำที่ออกเสียงเหมือนมี น สะกด แม้จะเขียนด้วยพยัญชนะต่างรูปกัน เช่น น, ญ, ณ, ร, ล, ฬ</w:t>
       </w:r>
     </w:p>
     <w:p>
@@ -1071,7 +1071,7 @@
         <w:pStyle w:val="BodyText"/>
       </w:pPr>
       <w:r>
-        <w:t xml:space="preserve">5.3 ครูแจกใบงานที่ 7 เรื่อง มาตราแม่กบ ให้นักเรียนนำไปทำเพื่อทบทวน พร้อมแจ้งกำหนดส่ง</w:t>
+        <w:t xml:space="preserve">5.3 ครูแจกใบงานที่ 7 เรื่อง มาตราแม่กน ให้นักเรียนนำไปทำเพื่อทบทวน พร้อมแจ้งกำหนดส่ง</w:t>
       </w:r>
     </w:p>
     <w:bookmarkEnd w:id="31"/>
@@ -1181,7 +1181,7 @@
         <w:t xml:space="preserve">“</w:t>
       </w:r>
       <w:r>
-        <w:t xml:space="preserve">เก็บเสบียงแม่กบ</w:t>
+        <w:t xml:space="preserve">เติมเชื้อเพลิงยานแม่กน</w:t>
       </w:r>
       <w:r>
         <w:t xml:space="preserve">”</w:t>
@@ -1199,7 +1199,7 @@
         <w:t xml:space="preserve">“</w:t>
       </w:r>
       <w:r>
-        <w:t xml:space="preserve">ไขปริศนาชาวเกาะ</w:t>
+        <w:t xml:space="preserve">สแกนรหัสลับต่างดาว</w:t>
       </w:r>
       <w:r>
         <w:t xml:space="preserve">”</w:t>
@@ -1217,7 +1217,7 @@
         <w:t xml:space="preserve">“</w:t>
       </w:r>
       <w:r>
-        <w:t xml:space="preserve">แผนผังเกาะแม่กบ</w:t>
+        <w:t xml:space="preserve">แผนที่ดาวแม่กน</w:t>
       </w:r>
       <w:r>
         <w:t xml:space="preserve">”</w:t>
@@ -1264,10 +1264,553 @@
       </w:r>
     </w:p>
     <w:p>
+      <w:r>
+        <w:pict>
+          <v:rect style="width:0;height:1.5pt" o:hralign="center" o:hrstd="t" o:hr="t"/>
+        </w:pict>
+      </w:r>
+    </w:p>
+    <w:bookmarkEnd w:id="34"/>
+    <w:bookmarkStart w:id="35" w:name="ผลการตรวจสอบ"/>
+    <w:p>
+      <w:pPr>
+        <w:pStyle w:val="Heading2"/>
+      </w:pPr>
+      <w:r>
+        <w:t xml:space="preserve">ผลการตรวจสอบ</w:t>
+      </w:r>
+    </w:p>
+    <w:p>
       <w:pPr>
         <w:pStyle w:val="FirstParagraph"/>
       </w:pPr>
       <w:r>
+        <w:t xml:space="preserve">ไม่พบข้อผิดพลาดที่ต้องแก้ไข แผนนี้สอดคล้องกับมาตรฐานที่ปรับปรุงมาจากแผนที่ 3-7 ครบทุกจุดตั้งแต่ต้นฉบับที่ส่งมา:</w:t>
+      </w:r>
+    </w:p>
+    <w:p>
+      <w:pPr>
+        <w:numPr>
+          <w:ilvl w:val="0"/>
+          <w:numId w:val="1008"/>
+        </w:numPr>
+        <w:pStyle w:val="Compact"/>
+      </w:pPr>
+      <w:r>
+        <w:t xml:space="preserve">คำตัวอย่างไม่ตรงมาตราครอบคลุมพยัญชนะไม่ตรงมาตราครบทั้ง 5 ตัว (ญ, ณ, ร, ล, ฬ)</w:t>
+      </w:r>
+    </w:p>
+    <w:p>
+      <w:pPr>
+        <w:numPr>
+          <w:ilvl w:val="0"/>
+          <w:numId w:val="1008"/>
+        </w:numPr>
+        <w:pStyle w:val="Compact"/>
+      </w:pPr>
+      <w:r>
+        <w:t xml:space="preserve">ข้อ 5.1 ใช้รูปแบบนิยาม</w:t>
+      </w:r>
+      <w:r>
+        <w:t xml:space="preserve"> </w:t>
+      </w:r>
+      <w:r>
+        <w:t xml:space="preserve">“</w:t>
+      </w:r>
+      <w:r>
+        <w:t xml:space="preserve">คือ คำที่ออกเสียงเหมือนมี ___ สะกด</w:t>
+      </w:r>
+      <w:r>
+        <w:t xml:space="preserve">”</w:t>
+      </w:r>
+      <w:r>
+        <w:t xml:space="preserve"> </w:t>
+      </w:r>
+      <w:r>
+        <w:t xml:space="preserve">ถูกต้อง</w:t>
+      </w:r>
+    </w:p>
+    <w:p>
+      <w:pPr>
+        <w:numPr>
+          <w:ilvl w:val="0"/>
+          <w:numId w:val="1008"/>
+        </w:numPr>
+        <w:pStyle w:val="Compact"/>
+      </w:pPr>
+      <w:r>
+        <w:t xml:space="preserve">จุดประสงค์ K มี</w:t>
+      </w:r>
+      <w:r>
+        <w:t xml:space="preserve"> </w:t>
+      </w:r>
+      <w:r>
+        <w:t xml:space="preserve">“</w:t>
+      </w:r>
+      <w:r>
+        <w:t xml:space="preserve">ความหมาย</w:t>
+      </w:r>
+      <w:r>
+        <w:t xml:space="preserve">”</w:t>
+      </w:r>
+      <w:r>
+        <w:t xml:space="preserve"> </w:t>
+      </w:r>
+      <w:r>
+        <w:t xml:space="preserve">และ A มี</w:t>
+      </w:r>
+      <w:r>
+        <w:t xml:space="preserve"> </w:t>
+      </w:r>
+      <w:r>
+        <w:t xml:space="preserve">“</w:t>
+      </w:r>
+      <w:r>
+        <w:t xml:space="preserve">ทำงานกลุ่ม</w:t>
+      </w:r>
+      <w:r>
+        <w:t xml:space="preserve">”</w:t>
+      </w:r>
+      <w:r>
+        <w:t xml:space="preserve"> </w:t>
+      </w:r>
+      <w:r>
+        <w:t xml:space="preserve">ครบ</w:t>
+      </w:r>
+    </w:p>
+    <w:p>
+      <w:pPr>
+        <w:numPr>
+          <w:ilvl w:val="0"/>
+          <w:numId w:val="1008"/>
+        </w:numPr>
+        <w:pStyle w:val="Compact"/>
+      </w:pPr>
+      <w:r>
+        <w:t xml:space="preserve">คำถาม True/False ในภารกิจ 3.2 ถูกต้องตามเจตนา</w:t>
+      </w:r>
+    </w:p>
+    <w:p>
+      <w:pPr>
+        <w:numPr>
+          <w:ilvl w:val="0"/>
+          <w:numId w:val="1008"/>
+        </w:numPr>
+        <w:pStyle w:val="Compact"/>
+      </w:pPr>
+      <w:r>
+        <w:t xml:space="preserve">เวลารวม 5+5+30+10+10 = 60 นาที ตรงตามที่ระบุ</w:t>
+      </w:r>
+    </w:p>
+    <w:p>
+      <w:pPr>
+        <w:numPr>
+          <w:ilvl w:val="0"/>
+          <w:numId w:val="1008"/>
+        </w:numPr>
+        <w:pStyle w:val="Compact"/>
+      </w:pPr>
+      <w:r>
+        <w:t xml:space="preserve">สื่อทั้งหมดผ่าน Web Application ไม่มีบัตรคำกระดาษ</w:t>
+      </w:r>
+    </w:p>
+    <w:p>
+      <w:pPr>
+        <w:numPr>
+          <w:ilvl w:val="0"/>
+          <w:numId w:val="1008"/>
+        </w:numPr>
+        <w:pStyle w:val="Compact"/>
+      </w:pPr>
+      <w:r>
+        <w:t xml:space="preserve">ชื่อภารกิจตรงกันทุกจุดระหว่างขั้นที่ 3, ข้อ 7 และข้อ 10</w:t>
+      </w:r>
+    </w:p>
+    <w:bookmarkEnd w:id="35"/>
+    <w:bookmarkStart w:id="36" w:name="สถานะหนวยการเรยนรท-3-8-ชวโมง"/>
+    <w:p>
+      <w:pPr>
+        <w:pStyle w:val="Heading2"/>
+      </w:pPr>
+      <w:r>
+        <w:t xml:space="preserve">สถานะหน่วยการเรียนรู้ที่ 3 (8 ชั่วโมง)</w:t>
+      </w:r>
+    </w:p>
+    <w:tbl>
+      <w:tblPr>
+        <w:tblStyle w:val="Table"/>
+        <w:tblW w:type="auto" w:w="0"/>
+        <w:tblLook w:firstRow="1" w:lastRow="0" w:firstColumn="0" w:lastColumn="0" w:noHBand="0" w:noVBand="0" w:val="0020"/>
+        <w:jc w:val="start"/>
+      </w:tblPr>
+      <w:tblGrid>
+        <w:gridCol w:w="2640"/>
+        <w:gridCol w:w="2640"/>
+        <w:gridCol w:w="2640"/>
+      </w:tblGrid>
+      <w:tr>
+        <w:trPr>
+          <w:tblHeader w:val="true"/>
+        </w:trPr>
+        <w:tc>
+          <w:tcPr/>
+          <w:p>
+            <w:pPr>
+              <w:pStyle w:val="Compact"/>
+              <w:jc w:val="left"/>
+            </w:pPr>
+            <w:r>
+              <w:t xml:space="preserve">แผนที่</w:t>
+            </w:r>
+          </w:p>
+        </w:tc>
+        <w:tc>
+          <w:tcPr/>
+          <w:p>
+            <w:pPr>
+              <w:pStyle w:val="Compact"/>
+              <w:jc w:val="left"/>
+            </w:pPr>
+            <w:r>
+              <w:t xml:space="preserve">มาตรา</w:t>
+            </w:r>
+          </w:p>
+        </w:tc>
+        <w:tc>
+          <w:tcPr/>
+          <w:p>
+            <w:pPr>
+              <w:pStyle w:val="Compact"/>
+              <w:jc w:val="left"/>
+            </w:pPr>
+            <w:r>
+              <w:t xml:space="preserve">สถานะ</w:t>
+            </w:r>
+          </w:p>
+        </w:tc>
+      </w:tr>
+      <w:tr>
+        <w:tc>
+          <w:tcPr/>
+          <w:p>
+            <w:pPr>
+              <w:pStyle w:val="Compact"/>
+              <w:jc w:val="left"/>
+            </w:pPr>
+            <w:r>
+              <w:t xml:space="preserve">1</w:t>
+            </w:r>
+          </w:p>
+        </w:tc>
+        <w:tc>
+          <w:tcPr/>
+          <w:p>
+            <w:pPr>
+              <w:pStyle w:val="Compact"/>
+              <w:jc w:val="left"/>
+            </w:pPr>
+            <w:r>
+              <w:t xml:space="preserve">แม่ ก กา</w:t>
+            </w:r>
+          </w:p>
+        </w:tc>
+        <w:tc>
+          <w:tcPr/>
+          <w:p>
+            <w:pPr>
+              <w:pStyle w:val="Compact"/>
+              <w:jc w:val="left"/>
+            </w:pPr>
+            <w:r>
+              <w:t xml:space="preserve">✅</w:t>
+            </w:r>
+          </w:p>
+        </w:tc>
+      </w:tr>
+      <w:tr>
+        <w:tc>
+          <w:tcPr/>
+          <w:p>
+            <w:pPr>
+              <w:pStyle w:val="Compact"/>
+              <w:jc w:val="left"/>
+            </w:pPr>
+            <w:r>
+              <w:t xml:space="preserve">2</w:t>
+            </w:r>
+          </w:p>
+        </w:tc>
+        <w:tc>
+          <w:tcPr/>
+          <w:p>
+            <w:pPr>
+              <w:pStyle w:val="Compact"/>
+              <w:jc w:val="left"/>
+            </w:pPr>
+            <w:r>
+              <w:t xml:space="preserve">แม่กง</w:t>
+            </w:r>
+          </w:p>
+        </w:tc>
+        <w:tc>
+          <w:tcPr/>
+          <w:p>
+            <w:pPr>
+              <w:pStyle w:val="Compact"/>
+              <w:jc w:val="left"/>
+            </w:pPr>
+            <w:r>
+              <w:t xml:space="preserve">✅</w:t>
+            </w:r>
+          </w:p>
+        </w:tc>
+      </w:tr>
+      <w:tr>
+        <w:tc>
+          <w:tcPr/>
+          <w:p>
+            <w:pPr>
+              <w:pStyle w:val="Compact"/>
+              <w:jc w:val="left"/>
+            </w:pPr>
+            <w:r>
+              <w:t xml:space="preserve">3</w:t>
+            </w:r>
+          </w:p>
+        </w:tc>
+        <w:tc>
+          <w:tcPr/>
+          <w:p>
+            <w:pPr>
+              <w:pStyle w:val="Compact"/>
+              <w:jc w:val="left"/>
+            </w:pPr>
+            <w:r>
+              <w:t xml:space="preserve">แม่กม</w:t>
+            </w:r>
+          </w:p>
+        </w:tc>
+        <w:tc>
+          <w:tcPr/>
+          <w:p>
+            <w:pPr>
+              <w:pStyle w:val="Compact"/>
+              <w:jc w:val="left"/>
+            </w:pPr>
+            <w:r>
+              <w:t xml:space="preserve">✅</w:t>
+            </w:r>
+          </w:p>
+        </w:tc>
+      </w:tr>
+      <w:tr>
+        <w:tc>
+          <w:tcPr/>
+          <w:p>
+            <w:pPr>
+              <w:pStyle w:val="Compact"/>
+              <w:jc w:val="left"/>
+            </w:pPr>
+            <w:r>
+              <w:t xml:space="preserve">4</w:t>
+            </w:r>
+          </w:p>
+        </w:tc>
+        <w:tc>
+          <w:tcPr/>
+          <w:p>
+            <w:pPr>
+              <w:pStyle w:val="Compact"/>
+              <w:jc w:val="left"/>
+            </w:pPr>
+            <w:r>
+              <w:t xml:space="preserve">แม่เกย + แม่เกอว</w:t>
+            </w:r>
+          </w:p>
+        </w:tc>
+        <w:tc>
+          <w:tcPr/>
+          <w:p>
+            <w:pPr>
+              <w:pStyle w:val="Compact"/>
+              <w:jc w:val="left"/>
+            </w:pPr>
+            <w:r>
+              <w:t xml:space="preserve">✅</w:t>
+            </w:r>
+          </w:p>
+        </w:tc>
+      </w:tr>
+      <w:tr>
+        <w:tc>
+          <w:tcPr/>
+          <w:p>
+            <w:pPr>
+              <w:pStyle w:val="Compact"/>
+              <w:jc w:val="left"/>
+            </w:pPr>
+            <w:r>
+              <w:t xml:space="preserve">5</w:t>
+            </w:r>
+          </w:p>
+        </w:tc>
+        <w:tc>
+          <w:tcPr/>
+          <w:p>
+            <w:pPr>
+              <w:pStyle w:val="Compact"/>
+              <w:jc w:val="left"/>
+            </w:pPr>
+            <w:r>
+              <w:t xml:space="preserve">แม่กก</w:t>
+            </w:r>
+          </w:p>
+        </w:tc>
+        <w:tc>
+          <w:tcPr/>
+          <w:p>
+            <w:pPr>
+              <w:pStyle w:val="Compact"/>
+              <w:jc w:val="left"/>
+            </w:pPr>
+            <w:r>
+              <w:t xml:space="preserve">✅</w:t>
+            </w:r>
+          </w:p>
+        </w:tc>
+      </w:tr>
+      <w:tr>
+        <w:tc>
+          <w:tcPr/>
+          <w:p>
+            <w:pPr>
+              <w:pStyle w:val="Compact"/>
+              <w:jc w:val="left"/>
+            </w:pPr>
+            <w:r>
+              <w:t xml:space="preserve">6</w:t>
+            </w:r>
+          </w:p>
+        </w:tc>
+        <w:tc>
+          <w:tcPr/>
+          <w:p>
+            <w:pPr>
+              <w:pStyle w:val="Compact"/>
+              <w:jc w:val="left"/>
+            </w:pPr>
+            <w:r>
+              <w:t xml:space="preserve">แม่กด</w:t>
+            </w:r>
+          </w:p>
+        </w:tc>
+        <w:tc>
+          <w:tcPr/>
+          <w:p>
+            <w:pPr>
+              <w:pStyle w:val="Compact"/>
+              <w:jc w:val="left"/>
+            </w:pPr>
+            <w:r>
+              <w:t xml:space="preserve">✅</w:t>
+            </w:r>
+          </w:p>
+        </w:tc>
+      </w:tr>
+      <w:tr>
+        <w:tc>
+          <w:tcPr/>
+          <w:p>
+            <w:pPr>
+              <w:pStyle w:val="Compact"/>
+              <w:jc w:val="left"/>
+            </w:pPr>
+            <w:r>
+              <w:t xml:space="preserve">7</w:t>
+            </w:r>
+          </w:p>
+        </w:tc>
+        <w:tc>
+          <w:tcPr/>
+          <w:p>
+            <w:pPr>
+              <w:pStyle w:val="Compact"/>
+              <w:jc w:val="left"/>
+            </w:pPr>
+            <w:r>
+              <w:t xml:space="preserve">แม่กบ</w:t>
+            </w:r>
+          </w:p>
+        </w:tc>
+        <w:tc>
+          <w:tcPr/>
+          <w:p>
+            <w:pPr>
+              <w:pStyle w:val="Compact"/>
+              <w:jc w:val="left"/>
+            </w:pPr>
+            <w:r>
+              <w:t xml:space="preserve">✅</w:t>
+            </w:r>
+          </w:p>
+        </w:tc>
+      </w:tr>
+      <w:tr>
+        <w:tc>
+          <w:tcPr/>
+          <w:p>
+            <w:pPr>
+              <w:pStyle w:val="Compact"/>
+              <w:jc w:val="left"/>
+            </w:pPr>
+            <w:r>
+              <w:t xml:space="preserve">8</w:t>
+            </w:r>
+          </w:p>
+        </w:tc>
+        <w:tc>
+          <w:tcPr/>
+          <w:p>
+            <w:pPr>
+              <w:pStyle w:val="Compact"/>
+              <w:jc w:val="left"/>
+            </w:pPr>
+            <w:r>
+              <w:t xml:space="preserve">แม่กน</w:t>
+            </w:r>
+          </w:p>
+        </w:tc>
+        <w:tc>
+          <w:tcPr/>
+          <w:p>
+            <w:pPr>
+              <w:pStyle w:val="Compact"/>
+              <w:jc w:val="left"/>
+            </w:pPr>
+            <w:r>
+              <w:t xml:space="preserve">✅</w:t>
+            </w:r>
+          </w:p>
+        </w:tc>
+      </w:tr>
+    </w:tbl>
+    <w:p>
+      <w:pPr>
+        <w:pStyle w:val="BodyText"/>
+      </w:pPr>
+      <w:r>
+        <w:rPr>
+          <w:bCs/>
+          <w:b/>
+        </w:rPr>
+        <w:t xml:space="preserve">ครบ 8 ชั่วโมง ครบทั้ง 9 มาตราตัวสะกดของภาษาไทยแล้วครับ</w:t>
+      </w:r>
+    </w:p>
+    <w:p>
+      <w:pPr>
+        <w:pStyle w:val="BodyText"/>
+      </w:pPr>
+      <w:r>
         <w:t xml:space="preserve">ลงชื่อ…………………………………………… ผู้สอน</w:t>
       </w:r>
     </w:p>
@@ -1287,8 +1830,8 @@
         <w:t xml:space="preserve">ตำแหน่ง ครู วิทยฐานะครูชำนาญการพิเศษ</w:t>
       </w:r>
     </w:p>
-    <w:bookmarkEnd w:id="34"/>
-    <w:bookmarkEnd w:id="35"/>
+    <w:bookmarkEnd w:id="36"/>
+    <w:bookmarkEnd w:id="37"/>
     <w:sectPr/>
   </w:body>
 </w:document>
@@ -1493,6 +2036,9 @@
     <w:abstractNumId w:val="991"/>
   </w:num>
   <w:num w:numId="1007">
+    <w:abstractNumId w:val="991"/>
+  </w:num>
+  <w:num w:numId="1008">
     <w:abstractNumId w:val="991"/>
   </w:num>
 </w:numbering>

</xml_diff>